<commit_message>
TRD-EHR: the code link pins da44a79a, which survives the LIBR purge
</commit_message>
<xml_diff>
--- a/projects/TRD-EHR/paper1-trd-prediction/cover_letter.docx
+++ b/projects/TRD-EHR/paper1-trd-prediction/cover_letter.docx
@@ -380,7 +380,7 @@
         <w:t xml:space="preserve"> </w:t>
       </w:r>
       <w:r>
-        <w:t xml:space="preserve">https://github.com/Pirate-Hunter-Zoro/Atlas/tree/main/projects/TRD-EHR. Ethics/IRB, funding,</w:t>
+        <w:t xml:space="preserve">https://github.com/Pirate-Hunter-Zoro/Atlas/tree/da44a79a7a68f7e57de2e2ba2e27a59835de9530/projects/TRD-EHR. Ethics/IRB, funding,</w:t>
       </w:r>
       <w:r>
         <w:t xml:space="preserve"> </w:t>
@@ -480,8 +480,8 @@
       </w:r>
     </w:p>
     <w:sectPr>
-      <w:pgSz w:h="15840" w:w="12240"/>
-      <w:pgMar w:bottom="1440" w:footer="708" w:gutter="0" w:header="708" w:left="1800" w:right="1800" w:top="1440"/>
+      <w:pgSz w:w="12240" w:h="15840"/>
+      <w:pgMar w:top="1440" w:right="1800" w:bottom="1440" w:left="1800" w:header="708" w:footer="708" w:gutter="0"/>
       <w:cols w:space="708"/>
       <w:docGrid w:linePitch="360"/>
     </w:sectPr>
@@ -513,8 +513,8 @@
 </file>
 
 <file path=word/numbering.xml><?xml version="1.0" encoding="utf-8"?>
-<w:numbering xmlns:aink="http://schemas.microsoft.com/office/drawing/2016/ink" xmlns:am3d="http://schemas.microsoft.com/office/drawing/2017/model3d" xmlns:cx="http://schemas.microsoft.com/office/drawing/2014/chartex" xmlns:cx1="http://schemas.microsoft.com/office/drawing/2015/9/8/chartex" xmlns:cx2="http://schemas.microsoft.com/office/drawing/2015/10/21/chartex" xmlns:cx3="http://schemas.microsoft.com/office/drawing/2016/5/9/chartex" xmlns:cx4="http://schemas.microsoft.com/office/drawing/2016/5/10/chartex" xmlns:cx5="http://schemas.microsoft.com/office/drawing/2016/5/11/chartex" xmlns:cx6="http://schemas.microsoft.com/office/drawing/2016/5/12/chartex" xmlns:cx7="http://schemas.microsoft.com/office/drawing/2016/5/13/chartex" xmlns:cx8="http://schemas.microsoft.com/office/drawing/2016/5/14/chartex" xmlns:m="http://schemas.openxmlformats.org/officeDocument/2006/math" xmlns:mc="http://schemas.openxmlformats.org/markup-compatibility/2006" xmlns:o="urn:schemas-microsoft-com:office:office" xmlns:oel="http://schemas.microsoft.com/office/2019/extlst" xmlns:r="http://schemas.openxmlformats.org/officeDocument/2006/relationships" xmlns:v="urn:schemas-microsoft-com:vml" xmlns:w="http://schemas.openxmlformats.org/wordprocessingml/2006/main" xmlns:w10="urn:schemas-microsoft-com:office:word" xmlns:w14="http://schemas.microsoft.com/office/word/2010/wordml" xmlns:w15="http://schemas.microsoft.com/office/word/2012/wordml" xmlns:w16="http://schemas.microsoft.com/office/word/2018/wordml" xmlns:w16cex="http://schemas.microsoft.com/office/word/2018/wordml/cex" xmlns:w16cid="http://schemas.microsoft.com/office/word/2016/wordml/cid" xmlns:w16sdtdh="http://schemas.microsoft.com/office/word/2020/wordml/sdtdatahash" xmlns:w16se="http://schemas.microsoft.com/office/word/2015/wordml/symex" xmlns:wne="http://schemas.microsoft.com/office/word/2006/wordml" xmlns:wp="http://schemas.openxmlformats.org/drawingml/2006/wordprocessingDrawing" xmlns:wp14="http://schemas.microsoft.com/office/word/2010/wordprocessingDrawing" xmlns:wpc="http://schemas.microsoft.com/office/word/2010/wordprocessingCanvas" xmlns:wpg="http://schemas.microsoft.com/office/word/2010/wordprocessingGroup" xmlns:wpi="http://schemas.microsoft.com/office/word/2010/wordprocessingInk" xmlns:wps="http://schemas.microsoft.com/office/word/2010/wordprocessingShape" mc:Ignorable="w14 w15 w16se w16cid w16 w16cex w16sdtdh wp14">
-  <w:abstractNum w15:restartNumberingAfterBreak="0" w:abstractNumId="0">
+<w:numbering xmlns:wpc="http://schemas.microsoft.com/office/word/2010/wordprocessingCanvas" xmlns:cx="http://schemas.microsoft.com/office/drawing/2014/chartex" xmlns:cx1="http://schemas.microsoft.com/office/drawing/2015/9/8/chartex" xmlns:cx2="http://schemas.microsoft.com/office/drawing/2015/10/21/chartex" xmlns:cx3="http://schemas.microsoft.com/office/drawing/2016/5/9/chartex" xmlns:cx4="http://schemas.microsoft.com/office/drawing/2016/5/10/chartex" xmlns:cx5="http://schemas.microsoft.com/office/drawing/2016/5/11/chartex" xmlns:cx6="http://schemas.microsoft.com/office/drawing/2016/5/12/chartex" xmlns:cx7="http://schemas.microsoft.com/office/drawing/2016/5/13/chartex" xmlns:cx8="http://schemas.microsoft.com/office/drawing/2016/5/14/chartex" xmlns:mc="http://schemas.openxmlformats.org/markup-compatibility/2006" xmlns:aink="http://schemas.microsoft.com/office/drawing/2016/ink" xmlns:am3d="http://schemas.microsoft.com/office/drawing/2017/model3d" xmlns:o="urn:schemas-microsoft-com:office:office" xmlns:oel="http://schemas.microsoft.com/office/2019/extlst" xmlns:r="http://schemas.openxmlformats.org/officeDocument/2006/relationships" xmlns:m="http://schemas.openxmlformats.org/officeDocument/2006/math" xmlns:v="urn:schemas-microsoft-com:vml" xmlns:wp14="http://schemas.microsoft.com/office/word/2010/wordprocessingDrawing" xmlns:wp="http://schemas.openxmlformats.org/drawingml/2006/wordprocessingDrawing" xmlns:w10="urn:schemas-microsoft-com:office:word" xmlns:w="http://schemas.openxmlformats.org/wordprocessingml/2006/main" xmlns:w14="http://schemas.microsoft.com/office/word/2010/wordml" xmlns:w15="http://schemas.microsoft.com/office/word/2012/wordml" xmlns:w16cex="http://schemas.microsoft.com/office/word/2018/wordml/cex" xmlns:w16cid="http://schemas.microsoft.com/office/word/2016/wordml/cid" xmlns:w16="http://schemas.microsoft.com/office/word/2018/wordml" xmlns:w16sdtdh="http://schemas.microsoft.com/office/word/2020/wordml/sdtdatahash" xmlns:w16se="http://schemas.microsoft.com/office/word/2015/wordml/symex" xmlns:wpg="http://schemas.microsoft.com/office/word/2010/wordprocessingGroup" xmlns:wpi="http://schemas.microsoft.com/office/word/2010/wordprocessingInk" xmlns:wne="http://schemas.microsoft.com/office/word/2006/wordml" xmlns:wps="http://schemas.microsoft.com/office/word/2010/wordprocessingShape" mc:Ignorable="w14 w15 w16se w16cid w16 w16cex w16sdtdh wp14">
+  <w:abstractNum w:abstractNumId="0" w15:restartNumberingAfterBreak="0">
     <w:nsid w:val="07765EBA"/>
     <w:multiLevelType w:val="hybridMultilevel"/>
     <w:tmpl w:val="8FA2D970"/>
@@ -524,83 +524,83 @@
       <w:lvlText w:val="%1."/>
       <w:lvlJc w:val="left"/>
       <w:pPr>
-        <w:ind w:hanging="360" w:left="720"/>
-      </w:pPr>
-    </w:lvl>
-    <w:lvl w:ilvl="1" w:tentative="1" w:tplc="04090019">
+        <w:ind w:left="720" w:hanging="360"/>
+      </w:pPr>
+    </w:lvl>
+    <w:lvl w:ilvl="1" w:tplc="04090019" w:tentative="1">
       <w:start w:val="1"/>
       <w:numFmt w:val="lowerLetter"/>
       <w:lvlText w:val="%2."/>
       <w:lvlJc w:val="left"/>
       <w:pPr>
-        <w:ind w:hanging="360" w:left="1440"/>
-      </w:pPr>
-    </w:lvl>
-    <w:lvl w:ilvl="2" w:tentative="1" w:tplc="0409001B">
+        <w:ind w:left="1440" w:hanging="360"/>
+      </w:pPr>
+    </w:lvl>
+    <w:lvl w:ilvl="2" w:tplc="0409001B" w:tentative="1">
       <w:start w:val="1"/>
       <w:numFmt w:val="lowerRoman"/>
       <w:lvlText w:val="%3."/>
       <w:lvlJc w:val="right"/>
       <w:pPr>
-        <w:ind w:hanging="180" w:left="2160"/>
-      </w:pPr>
-    </w:lvl>
-    <w:lvl w:ilvl="3" w:tentative="1" w:tplc="0409000F">
+        <w:ind w:left="2160" w:hanging="180"/>
+      </w:pPr>
+    </w:lvl>
+    <w:lvl w:ilvl="3" w:tplc="0409000F" w:tentative="1">
       <w:start w:val="1"/>
       <w:numFmt w:val="decimal"/>
       <w:lvlText w:val="%4."/>
       <w:lvlJc w:val="left"/>
       <w:pPr>
-        <w:ind w:hanging="360" w:left="2880"/>
-      </w:pPr>
-    </w:lvl>
-    <w:lvl w:ilvl="4" w:tentative="1" w:tplc="04090019">
+        <w:ind w:left="2880" w:hanging="360"/>
+      </w:pPr>
+    </w:lvl>
+    <w:lvl w:ilvl="4" w:tplc="04090019" w:tentative="1">
       <w:start w:val="1"/>
       <w:numFmt w:val="lowerLetter"/>
       <w:lvlText w:val="%5."/>
       <w:lvlJc w:val="left"/>
       <w:pPr>
-        <w:ind w:hanging="360" w:left="3600"/>
-      </w:pPr>
-    </w:lvl>
-    <w:lvl w:ilvl="5" w:tentative="1" w:tplc="0409001B">
+        <w:ind w:left="3600" w:hanging="360"/>
+      </w:pPr>
+    </w:lvl>
+    <w:lvl w:ilvl="5" w:tplc="0409001B" w:tentative="1">
       <w:start w:val="1"/>
       <w:numFmt w:val="lowerRoman"/>
       <w:lvlText w:val="%6."/>
       <w:lvlJc w:val="right"/>
       <w:pPr>
-        <w:ind w:hanging="180" w:left="4320"/>
-      </w:pPr>
-    </w:lvl>
-    <w:lvl w:ilvl="6" w:tentative="1" w:tplc="0409000F">
+        <w:ind w:left="4320" w:hanging="180"/>
+      </w:pPr>
+    </w:lvl>
+    <w:lvl w:ilvl="6" w:tplc="0409000F" w:tentative="1">
       <w:start w:val="1"/>
       <w:numFmt w:val="decimal"/>
       <w:lvlText w:val="%7."/>
       <w:lvlJc w:val="left"/>
       <w:pPr>
-        <w:ind w:hanging="360" w:left="5040"/>
-      </w:pPr>
-    </w:lvl>
-    <w:lvl w:ilvl="7" w:tentative="1" w:tplc="04090019">
+        <w:ind w:left="5040" w:hanging="360"/>
+      </w:pPr>
+    </w:lvl>
+    <w:lvl w:ilvl="7" w:tplc="04090019" w:tentative="1">
       <w:start w:val="1"/>
       <w:numFmt w:val="lowerLetter"/>
       <w:lvlText w:val="%8."/>
       <w:lvlJc w:val="left"/>
       <w:pPr>
-        <w:ind w:hanging="360" w:left="5760"/>
-      </w:pPr>
-    </w:lvl>
-    <w:lvl w:ilvl="8" w:tentative="1" w:tplc="0409001B">
+        <w:ind w:left="5760" w:hanging="360"/>
+      </w:pPr>
+    </w:lvl>
+    <w:lvl w:ilvl="8" w:tplc="0409001B" w:tentative="1">
       <w:start w:val="1"/>
       <w:numFmt w:val="lowerRoman"/>
       <w:lvlText w:val="%9."/>
       <w:lvlJc w:val="right"/>
       <w:pPr>
-        <w:ind w:hanging="180" w:left="6480"/>
+        <w:ind w:left="6480" w:hanging="180"/>
       </w:pPr>
     </w:lvl>
   </w:abstractNum>
-  <w:abstractNum w15:restartNumberingAfterBreak="0" w:abstractNumId="1">
+  <w:abstractNum w:abstractNumId="1" w15:restartNumberingAfterBreak="0">
     <w:nsid w:val="4BE25BE6"/>
     <w:multiLevelType w:val="hybridMultilevel"/>
     <w:tmpl w:val="2CAE5C14"/>
@@ -610,82 +610,82 @@
       <w:lvlText w:val="%1."/>
       <w:lvlJc w:val="left"/>
       <w:pPr>
-        <w:ind w:hanging="360" w:left="785"/>
+        <w:ind w:left="785" w:hanging="360"/>
       </w:pPr>
       <w:rPr>
         <w:rFonts w:hint="default"/>
       </w:rPr>
     </w:lvl>
-    <w:lvl w:ilvl="1" w:tentative="1" w:tplc="04090019">
+    <w:lvl w:ilvl="1" w:tplc="04090019" w:tentative="1">
       <w:start w:val="1"/>
       <w:numFmt w:val="lowerLetter"/>
       <w:lvlText w:val="%2."/>
       <w:lvlJc w:val="left"/>
       <w:pPr>
-        <w:ind w:hanging="360" w:left="1440"/>
-      </w:pPr>
-    </w:lvl>
-    <w:lvl w:ilvl="2" w:tentative="1" w:tplc="0409001B">
+        <w:ind w:left="1440" w:hanging="360"/>
+      </w:pPr>
+    </w:lvl>
+    <w:lvl w:ilvl="2" w:tplc="0409001B" w:tentative="1">
       <w:start w:val="1"/>
       <w:numFmt w:val="lowerRoman"/>
       <w:lvlText w:val="%3."/>
       <w:lvlJc w:val="right"/>
       <w:pPr>
-        <w:ind w:hanging="180" w:left="2160"/>
-      </w:pPr>
-    </w:lvl>
-    <w:lvl w:ilvl="3" w:tentative="1" w:tplc="0409000F">
+        <w:ind w:left="2160" w:hanging="180"/>
+      </w:pPr>
+    </w:lvl>
+    <w:lvl w:ilvl="3" w:tplc="0409000F" w:tentative="1">
       <w:start w:val="1"/>
       <w:numFmt w:val="decimal"/>
       <w:lvlText w:val="%4."/>
       <w:lvlJc w:val="left"/>
       <w:pPr>
-        <w:ind w:hanging="360" w:left="2880"/>
-      </w:pPr>
-    </w:lvl>
-    <w:lvl w:ilvl="4" w:tentative="1" w:tplc="04090019">
+        <w:ind w:left="2880" w:hanging="360"/>
+      </w:pPr>
+    </w:lvl>
+    <w:lvl w:ilvl="4" w:tplc="04090019" w:tentative="1">
       <w:start w:val="1"/>
       <w:numFmt w:val="lowerLetter"/>
       <w:lvlText w:val="%5."/>
       <w:lvlJc w:val="left"/>
       <w:pPr>
-        <w:ind w:hanging="360" w:left="3600"/>
-      </w:pPr>
-    </w:lvl>
-    <w:lvl w:ilvl="5" w:tentative="1" w:tplc="0409001B">
+        <w:ind w:left="3600" w:hanging="360"/>
+      </w:pPr>
+    </w:lvl>
+    <w:lvl w:ilvl="5" w:tplc="0409001B" w:tentative="1">
       <w:start w:val="1"/>
       <w:numFmt w:val="lowerRoman"/>
       <w:lvlText w:val="%6."/>
       <w:lvlJc w:val="right"/>
       <w:pPr>
-        <w:ind w:hanging="180" w:left="4320"/>
-      </w:pPr>
-    </w:lvl>
-    <w:lvl w:ilvl="6" w:tentative="1" w:tplc="0409000F">
+        <w:ind w:left="4320" w:hanging="180"/>
+      </w:pPr>
+    </w:lvl>
+    <w:lvl w:ilvl="6" w:tplc="0409000F" w:tentative="1">
       <w:start w:val="1"/>
       <w:numFmt w:val="decimal"/>
       <w:lvlText w:val="%7."/>
       <w:lvlJc w:val="left"/>
       <w:pPr>
-        <w:ind w:hanging="360" w:left="5040"/>
-      </w:pPr>
-    </w:lvl>
-    <w:lvl w:ilvl="7" w:tentative="1" w:tplc="04090019">
+        <w:ind w:left="5040" w:hanging="360"/>
+      </w:pPr>
+    </w:lvl>
+    <w:lvl w:ilvl="7" w:tplc="04090019" w:tentative="1">
       <w:start w:val="1"/>
       <w:numFmt w:val="lowerLetter"/>
       <w:lvlText w:val="%8."/>
       <w:lvlJc w:val="left"/>
       <w:pPr>
-        <w:ind w:hanging="360" w:left="5760"/>
-      </w:pPr>
-    </w:lvl>
-    <w:lvl w:ilvl="8" w:tentative="1" w:tplc="0409001B">
+        <w:ind w:left="5760" w:hanging="360"/>
+      </w:pPr>
+    </w:lvl>
+    <w:lvl w:ilvl="8" w:tplc="0409001B" w:tentative="1">
       <w:start w:val="1"/>
       <w:numFmt w:val="lowerRoman"/>
       <w:lvlText w:val="%9."/>
       <w:lvlJc w:val="right"/>
       <w:pPr>
-        <w:ind w:hanging="180" w:left="6480"/>
+        <w:ind w:left="6480" w:hanging="180"/>
       </w:pPr>
     </w:lvl>
   </w:abstractNum>
@@ -765,10 +765,10 @@
       </w:pPr>
     </w:lvl>
   </w:abstractNum>
-  <w:num w16cid:durableId="1305820082" w:numId="1">
+  <w:num w:numId="1" w16cid:durableId="1305820082">
     <w:abstractNumId w:val="1"/>
   </w:num>
-  <w:num w16cid:durableId="1012412166" w:numId="2">
+  <w:num w:numId="2" w16cid:durableId="1012412166">
     <w:abstractNumId w:val="0"/>
   </w:num>
   <w:num w:numId="1000">
@@ -778,29 +778,29 @@
 </file>
 
 <file path=word/styles.xml><?xml version="1.0" encoding="utf-8"?>
-<w:styles xmlns:mc="http://schemas.openxmlformats.org/markup-compatibility/2006" xmlns:r="http://schemas.openxmlformats.org/officeDocument/2006/relationships" xmlns:w="http://schemas.openxmlformats.org/wordprocessingml/2006/main" xmlns:w14="http://schemas.microsoft.com/office/word/2010/wordml" xmlns:w15="http://schemas.microsoft.com/office/word/2012/wordml" xmlns:w16="http://schemas.microsoft.com/office/word/2018/wordml" xmlns:w16cex="http://schemas.microsoft.com/office/word/2018/wordml/cex" xmlns:w16cid="http://schemas.microsoft.com/office/word/2016/wordml/cid" xmlns:w16sdtdh="http://schemas.microsoft.com/office/word/2020/wordml/sdtdatahash" xmlns:w16se="http://schemas.microsoft.com/office/word/2015/wordml/symex" mc:Ignorable="w14 w15 w16se w16cid w16 w16cex w16sdtdh">
+<w:styles xmlns:mc="http://schemas.openxmlformats.org/markup-compatibility/2006" xmlns:r="http://schemas.openxmlformats.org/officeDocument/2006/relationships" xmlns:w="http://schemas.openxmlformats.org/wordprocessingml/2006/main" xmlns:w14="http://schemas.microsoft.com/office/word/2010/wordml" xmlns:w15="http://schemas.microsoft.com/office/word/2012/wordml" xmlns:w16cex="http://schemas.microsoft.com/office/word/2018/wordml/cex" xmlns:w16cid="http://schemas.microsoft.com/office/word/2016/wordml/cid" xmlns:w16="http://schemas.microsoft.com/office/word/2018/wordml" xmlns:w16sdtdh="http://schemas.microsoft.com/office/word/2020/wordml/sdtdatahash" xmlns:w16se="http://schemas.microsoft.com/office/word/2015/wordml/symex" mc:Ignorable="w14 w15 w16se w16cid w16 w16cex w16sdtdh">
   <w:docDefaults>
     <w:rPrDefault>
       <w:rPr>
-        <w:rFonts w:asciiTheme="minorHAnsi" w:cstheme="minorBidi" w:eastAsiaTheme="minorEastAsia" w:hAnsiTheme="minorHAnsi"/>
+        <w:rFonts w:asciiTheme="minorHAnsi" w:eastAsiaTheme="minorEastAsia" w:hAnsiTheme="minorHAnsi" w:cstheme="minorBidi"/>
         <w:sz w:val="24"/>
         <w:szCs w:val="24"/>
-        <w:lang w:bidi="ar-SA" w:eastAsia="en-US" w:val="en-US"/>
+        <w:lang w:val="en-US" w:eastAsia="en-US" w:bidi="ar-SA"/>
       </w:rPr>
     </w:rPrDefault>
     <w:pPrDefault/>
   </w:docDefaults>
-  <w:latentStyles w:count="376" w:defLockedState="0" w:defQFormat="0" w:defSemiHidden="0" w:defUIPriority="99" w:defUnhideWhenUsed="0">
-    <w:lsdException w:name="Normal" w:qFormat="1" w:uiPriority="0"/>
-    <w:lsdException w:name="heading 1" w:qFormat="1" w:uiPriority="9"/>
-    <w:lsdException w:name="heading 2" w:qFormat="1" w:semiHidden="1" w:uiPriority="9" w:unhideWhenUsed="1"/>
-    <w:lsdException w:name="heading 3" w:qFormat="1" w:semiHidden="1" w:uiPriority="9" w:unhideWhenUsed="1"/>
-    <w:lsdException w:name="heading 4" w:qFormat="1" w:semiHidden="1" w:uiPriority="9" w:unhideWhenUsed="1"/>
-    <w:lsdException w:name="heading 5" w:qFormat="1" w:semiHidden="1" w:uiPriority="9" w:unhideWhenUsed="1"/>
-    <w:lsdException w:name="heading 6" w:qFormat="1" w:semiHidden="1" w:uiPriority="9" w:unhideWhenUsed="1"/>
-    <w:lsdException w:name="heading 7" w:qFormat="1" w:semiHidden="1" w:uiPriority="9" w:unhideWhenUsed="1"/>
-    <w:lsdException w:name="heading 8" w:qFormat="1" w:semiHidden="1" w:uiPriority="9" w:unhideWhenUsed="1"/>
-    <w:lsdException w:name="heading 9" w:qFormat="1" w:semiHidden="1" w:uiPriority="9" w:unhideWhenUsed="1"/>
+  <w:latentStyles w:defLockedState="0" w:defUIPriority="99" w:defSemiHidden="0" w:defUnhideWhenUsed="0" w:defQFormat="0" w:count="376">
+    <w:lsdException w:name="Normal" w:uiPriority="0" w:qFormat="1"/>
+    <w:lsdException w:name="heading 1" w:uiPriority="9" w:qFormat="1"/>
+    <w:lsdException w:name="heading 2" w:semiHidden="1" w:uiPriority="9" w:unhideWhenUsed="1" w:qFormat="1"/>
+    <w:lsdException w:name="heading 3" w:semiHidden="1" w:uiPriority="9" w:unhideWhenUsed="1" w:qFormat="1"/>
+    <w:lsdException w:name="heading 4" w:semiHidden="1" w:uiPriority="9" w:unhideWhenUsed="1" w:qFormat="1"/>
+    <w:lsdException w:name="heading 5" w:semiHidden="1" w:uiPriority="9" w:unhideWhenUsed="1" w:qFormat="1"/>
+    <w:lsdException w:name="heading 6" w:semiHidden="1" w:uiPriority="9" w:unhideWhenUsed="1" w:qFormat="1"/>
+    <w:lsdException w:name="heading 7" w:semiHidden="1" w:uiPriority="9" w:unhideWhenUsed="1" w:qFormat="1"/>
+    <w:lsdException w:name="heading 8" w:semiHidden="1" w:uiPriority="9" w:unhideWhenUsed="1" w:qFormat="1"/>
+    <w:lsdException w:name="heading 9" w:semiHidden="1" w:uiPriority="9" w:unhideWhenUsed="1" w:qFormat="1"/>
     <w:lsdException w:name="index 1" w:semiHidden="1" w:unhideWhenUsed="1"/>
     <w:lsdException w:name="index 2" w:semiHidden="1" w:unhideWhenUsed="1"/>
     <w:lsdException w:name="index 3" w:semiHidden="1" w:unhideWhenUsed="1"/>
@@ -825,7 +825,7 @@
     <w:lsdException w:name="header" w:semiHidden="1" w:unhideWhenUsed="1"/>
     <w:lsdException w:name="footer" w:semiHidden="1" w:unhideWhenUsed="1"/>
     <w:lsdException w:name="index heading" w:semiHidden="1" w:unhideWhenUsed="1"/>
-    <w:lsdException w:name="caption" w:qFormat="1" w:semiHidden="1" w:uiPriority="35" w:unhideWhenUsed="1"/>
+    <w:lsdException w:name="caption" w:semiHidden="1" w:uiPriority="35" w:unhideWhenUsed="1" w:qFormat="1"/>
     <w:lsdException w:name="table of figures" w:semiHidden="1" w:unhideWhenUsed="1"/>
     <w:lsdException w:name="envelope address" w:semiHidden="1" w:unhideWhenUsed="1"/>
     <w:lsdException w:name="envelope return" w:semiHidden="1" w:unhideWhenUsed="1"/>
@@ -853,7 +853,7 @@
     <w:lsdException w:name="List Number 3" w:semiHidden="1" w:unhideWhenUsed="1"/>
     <w:lsdException w:name="List Number 4" w:semiHidden="1" w:unhideWhenUsed="1"/>
     <w:lsdException w:name="List Number 5" w:semiHidden="1" w:unhideWhenUsed="1"/>
-    <w:lsdException w:name="Title" w:qFormat="1" w:uiPriority="10"/>
+    <w:lsdException w:name="Title" w:uiPriority="10" w:qFormat="1"/>
     <w:lsdException w:name="Closing" w:semiHidden="1" w:unhideWhenUsed="1"/>
     <w:lsdException w:name="Signature" w:semiHidden="1" w:unhideWhenUsed="1"/>
     <w:lsdException w:name="Default Paragraph Font" w:semiHidden="1" w:uiPriority="1" w:unhideWhenUsed="1"/>
@@ -865,7 +865,7 @@
     <w:lsdException w:name="List Continue 4" w:semiHidden="1" w:unhideWhenUsed="1"/>
     <w:lsdException w:name="List Continue 5" w:semiHidden="1" w:unhideWhenUsed="1"/>
     <w:lsdException w:name="Message Header" w:semiHidden="1" w:unhideWhenUsed="1"/>
-    <w:lsdException w:name="Subtitle" w:qFormat="1" w:uiPriority="11"/>
+    <w:lsdException w:name="Subtitle" w:uiPriority="11" w:qFormat="1"/>
     <w:lsdException w:name="Salutation" w:semiHidden="1" w:unhideWhenUsed="1"/>
     <w:lsdException w:name="Date" w:semiHidden="1" w:unhideWhenUsed="1"/>
     <w:lsdException w:name="Body Text First Indent" w:semiHidden="1" w:unhideWhenUsed="1"/>
@@ -878,8 +878,8 @@
     <w:lsdException w:name="Block Text" w:semiHidden="1" w:unhideWhenUsed="1"/>
     <w:lsdException w:name="Hyperlink" w:semiHidden="1" w:unhideWhenUsed="1"/>
     <w:lsdException w:name="FollowedHyperlink" w:semiHidden="1" w:unhideWhenUsed="1"/>
-    <w:lsdException w:name="Strong" w:qFormat="1" w:uiPriority="22"/>
-    <w:lsdException w:name="Emphasis" w:qFormat="1" w:uiPriority="20"/>
+    <w:lsdException w:name="Strong" w:uiPriority="22" w:qFormat="1"/>
+    <w:lsdException w:name="Emphasis" w:uiPriority="20" w:qFormat="1"/>
     <w:lsdException w:name="Document Map" w:semiHidden="1" w:unhideWhenUsed="1"/>
     <w:lsdException w:name="Plain Text" w:semiHidden="1" w:unhideWhenUsed="1"/>
     <w:lsdException w:name="E-mail Signature" w:semiHidden="1" w:unhideWhenUsed="1"/>
@@ -948,7 +948,7 @@
     <w:lsdException w:name="Table Grid" w:uiPriority="59"/>
     <w:lsdException w:name="Table Theme" w:semiHidden="1" w:unhideWhenUsed="1"/>
     <w:lsdException w:name="Placeholder Text" w:semiHidden="1"/>
-    <w:lsdException w:name="No Spacing" w:qFormat="1" w:uiPriority="1"/>
+    <w:lsdException w:name="No Spacing" w:uiPriority="1" w:qFormat="1"/>
     <w:lsdException w:name="Light Shading" w:uiPriority="60"/>
     <w:lsdException w:name="Light List" w:uiPriority="61"/>
     <w:lsdException w:name="Light Grid" w:uiPriority="62"/>
@@ -970,9 +970,9 @@
     <w:lsdException w:name="Medium Shading 2 Accent 1" w:uiPriority="64"/>
     <w:lsdException w:name="Medium List 1 Accent 1" w:uiPriority="65"/>
     <w:lsdException w:name="Revision" w:semiHidden="1"/>
-    <w:lsdException w:name="List Paragraph" w:qFormat="1" w:uiPriority="34"/>
-    <w:lsdException w:name="Quote" w:qFormat="1" w:uiPriority="29"/>
-    <w:lsdException w:name="Intense Quote" w:qFormat="1" w:uiPriority="30"/>
+    <w:lsdException w:name="List Paragraph" w:uiPriority="34" w:qFormat="1"/>
+    <w:lsdException w:name="Quote" w:uiPriority="29" w:qFormat="1"/>
+    <w:lsdException w:name="Intense Quote" w:uiPriority="30" w:qFormat="1"/>
     <w:lsdException w:name="Medium List 2 Accent 1" w:uiPriority="66"/>
     <w:lsdException w:name="Medium Grid 1 Accent 1" w:uiPriority="67"/>
     <w:lsdException w:name="Medium Grid 2 Accent 1" w:uiPriority="68"/>
@@ -1051,13 +1051,13 @@
     <w:lsdException w:name="Colorful Shading Accent 6" w:uiPriority="71"/>
     <w:lsdException w:name="Colorful List Accent 6" w:uiPriority="72"/>
     <w:lsdException w:name="Colorful Grid Accent 6" w:uiPriority="73"/>
-    <w:lsdException w:name="Subtle Emphasis" w:qFormat="1" w:uiPriority="19"/>
-    <w:lsdException w:name="Intense Emphasis" w:qFormat="1" w:uiPriority="21"/>
-    <w:lsdException w:name="Subtle Reference" w:qFormat="1" w:uiPriority="31"/>
-    <w:lsdException w:name="Intense Reference" w:qFormat="1" w:uiPriority="32"/>
-    <w:lsdException w:name="Book Title" w:qFormat="1" w:uiPriority="33"/>
+    <w:lsdException w:name="Subtle Emphasis" w:uiPriority="19" w:qFormat="1"/>
+    <w:lsdException w:name="Intense Emphasis" w:uiPriority="21" w:qFormat="1"/>
+    <w:lsdException w:name="Subtle Reference" w:uiPriority="31" w:qFormat="1"/>
+    <w:lsdException w:name="Intense Reference" w:uiPriority="32" w:qFormat="1"/>
+    <w:lsdException w:name="Book Title" w:uiPriority="33" w:qFormat="1"/>
     <w:lsdException w:name="Bibliography" w:semiHidden="1" w:uiPriority="37" w:unhideWhenUsed="1"/>
-    <w:lsdException w:name="TOC Heading" w:qFormat="1" w:semiHidden="1" w:uiPriority="39" w:unhideWhenUsed="1"/>
+    <w:lsdException w:name="TOC Heading" w:semiHidden="1" w:uiPriority="39" w:unhideWhenUsed="1" w:qFormat="1"/>
     <w:lsdException w:name="Grid Table 4" w:uiPriority="49"/>
     <w:lsdException w:name="Grid Table 5 Dark" w:uiPriority="50"/>
     <w:lsdException w:name="Grid Table 6 Colorful" w:uiPriority="51"/>
@@ -1159,11 +1159,11 @@
     <w:lsdException w:name="Unresolved Mention" w:semiHidden="1" w:unhideWhenUsed="1"/>
     <w:lsdException w:name="Smart Link" w:semiHidden="1" w:unhideWhenUsed="1"/>
   </w:latentStyles>
-  <w:style w:default="1" w:styleId="Normal" w:type="paragraph">
+  <w:style w:type="paragraph" w:default="1" w:styleId="Normal">
     <w:name w:val="Normal"/>
     <w:qFormat/>
   </w:style>
-  <w:style w:styleId="Heading1" w:type="paragraph">
+  <w:style w:type="paragraph" w:styleId="Heading1">
     <w:name w:val="heading 1"/>
     <w:basedOn w:val="Normal"/>
     <w:next w:val="Normal"/>
@@ -1174,19 +1174,19 @@
     <w:pPr>
       <w:keepNext/>
       <w:keepLines/>
-      <w:spacing w:after="200" w:before="720"/>
+      <w:spacing w:before="720" w:after="200"/>
       <w:outlineLvl w:val="0"/>
     </w:pPr>
     <w:rPr>
-      <w:rFonts w:asciiTheme="majorHAnsi" w:cstheme="majorBidi" w:eastAsiaTheme="majorEastAsia" w:hAnsiTheme="majorHAnsi"/>
+      <w:rFonts w:asciiTheme="majorHAnsi" w:eastAsiaTheme="majorEastAsia" w:hAnsiTheme="majorHAnsi" w:cstheme="majorBidi"/>
       <w:b/>
       <w:bCs/>
-      <w:color w:themeColor="accent1" w:themeShade="B5" w:val="345A8A"/>
+      <w:color w:val="345A8A" w:themeColor="accent1" w:themeShade="B5"/>
       <w:sz w:val="32"/>
       <w:szCs w:val="32"/>
     </w:rPr>
   </w:style>
-  <w:style w:styleId="Heading2" w:type="paragraph">
+  <w:style w:type="paragraph" w:styleId="Heading2">
     <w:name w:val="heading 2"/>
     <w:basedOn w:val="Normal"/>
     <w:next w:val="Normal"/>
@@ -1198,19 +1198,19 @@
     <w:pPr>
       <w:keepNext/>
       <w:keepLines/>
-      <w:spacing w:after="140" w:before="400"/>
+      <w:spacing w:before="400" w:after="140"/>
       <w:outlineLvl w:val="1"/>
     </w:pPr>
     <w:rPr>
-      <w:rFonts w:asciiTheme="majorHAnsi" w:cstheme="majorBidi" w:eastAsiaTheme="majorEastAsia" w:hAnsiTheme="majorHAnsi"/>
+      <w:rFonts w:asciiTheme="majorHAnsi" w:eastAsiaTheme="majorEastAsia" w:hAnsiTheme="majorHAnsi" w:cstheme="majorBidi"/>
       <w:b/>
       <w:bCs/>
-      <w:color w:themeColor="accent1" w:val="4F81BD"/>
+      <w:color w:val="4F81BD" w:themeColor="accent1"/>
       <w:sz w:val="26"/>
       <w:szCs w:val="26"/>
     </w:rPr>
   </w:style>
-  <w:style w:styleId="Heading3" w:type="paragraph">
+  <w:style w:type="paragraph" w:styleId="Heading3">
     <w:name w:val="heading 3"/>
     <w:basedOn w:val="Normal"/>
     <w:next w:val="Normal"/>
@@ -1222,17 +1222,17 @@
     <w:pPr>
       <w:keepNext/>
       <w:keepLines/>
-      <w:spacing w:after="120" w:before="320"/>
+      <w:spacing w:before="320" w:after="120"/>
       <w:outlineLvl w:val="2"/>
     </w:pPr>
     <w:rPr>
-      <w:rFonts w:asciiTheme="majorHAnsi" w:cstheme="majorBidi" w:eastAsiaTheme="majorEastAsia" w:hAnsiTheme="majorHAnsi"/>
+      <w:rFonts w:asciiTheme="majorHAnsi" w:eastAsiaTheme="majorEastAsia" w:hAnsiTheme="majorHAnsi" w:cstheme="majorBidi"/>
       <w:b/>
       <w:bCs/>
-      <w:color w:themeColor="accent1" w:val="4F81BD"/>
-    </w:rPr>
-  </w:style>
-  <w:style w:styleId="Heading4" w:type="paragraph">
+      <w:color w:val="4F81BD" w:themeColor="accent1"/>
+    </w:rPr>
+  </w:style>
+  <w:style w:type="paragraph" w:styleId="Heading4">
     <w:name w:val="heading 4"/>
     <w:basedOn w:val="Normal"/>
     <w:next w:val="Normal"/>
@@ -1244,46 +1244,46 @@
     <w:pPr>
       <w:keepNext/>
       <w:keepLines/>
-      <w:spacing w:after="100" w:before="280"/>
+      <w:spacing w:before="280" w:after="100"/>
       <w:outlineLvl w:val="3"/>
     </w:pPr>
     <w:rPr>
-      <w:rFonts w:asciiTheme="majorHAnsi" w:cstheme="majorBidi" w:eastAsiaTheme="majorEastAsia" w:hAnsiTheme="majorHAnsi"/>
+      <w:rFonts w:asciiTheme="majorHAnsi" w:eastAsiaTheme="majorEastAsia" w:hAnsiTheme="majorHAnsi" w:cstheme="majorBidi"/>
       <w:b/>
       <w:bCs/>
       <w:i/>
       <w:iCs/>
-      <w:color w:themeColor="accent1" w:val="4F81BD"/>
-    </w:rPr>
-  </w:style>
-  <w:style w:default="1" w:styleId="DefaultParagraphFont" w:type="character">
+      <w:color w:val="4F81BD" w:themeColor="accent1"/>
+    </w:rPr>
+  </w:style>
+  <w:style w:type="character" w:default="1" w:styleId="DefaultParagraphFont">
     <w:name w:val="Default Paragraph Font"/>
     <w:uiPriority w:val="1"/>
     <w:semiHidden/>
     <w:unhideWhenUsed/>
   </w:style>
-  <w:style w:default="1" w:styleId="TableNormal" w:type="table">
+  <w:style w:type="table" w:default="1" w:styleId="TableNormal">
     <w:name w:val="Normal Table"/>
     <w:uiPriority w:val="99"/>
     <w:semiHidden/>
     <w:unhideWhenUsed/>
     <w:tblPr>
-      <w:tblInd w:type="dxa" w:w="0"/>
+      <w:tblInd w:w="0" w:type="dxa"/>
       <w:tblCellMar>
-        <w:top w:type="dxa" w:w="0"/>
-        <w:left w:type="dxa" w:w="108"/>
-        <w:bottom w:type="dxa" w:w="0"/>
-        <w:right w:type="dxa" w:w="108"/>
+        <w:top w:w="0" w:type="dxa"/>
+        <w:left w:w="108" w:type="dxa"/>
+        <w:bottom w:w="0" w:type="dxa"/>
+        <w:right w:w="108" w:type="dxa"/>
       </w:tblCellMar>
     </w:tblPr>
   </w:style>
-  <w:style w:default="1" w:styleId="NoList" w:type="numbering">
+  <w:style w:type="numbering" w:default="1" w:styleId="NoList">
     <w:name w:val="No List"/>
     <w:uiPriority w:val="99"/>
     <w:semiHidden/>
     <w:unhideWhenUsed/>
   </w:style>
-  <w:style w:styleId="CommentReference" w:type="character">
+  <w:style w:type="character" w:styleId="CommentReference">
     <w:name w:val="annotation reference"/>
     <w:basedOn w:val="DefaultParagraphFont"/>
     <w:uiPriority w:val="99"/>
@@ -1295,7 +1295,7 @@
       <w:szCs w:val="18"/>
     </w:rPr>
   </w:style>
-  <w:style w:styleId="CommentText" w:type="paragraph">
+  <w:style w:type="paragraph" w:styleId="CommentText">
     <w:name w:val="annotation text"/>
     <w:basedOn w:val="Normal"/>
     <w:link w:val="CommentTextChar"/>
@@ -1304,7 +1304,7 @@
     <w:unhideWhenUsed/>
     <w:rsid w:val="00A4097A"/>
   </w:style>
-  <w:style w:customStyle="1" w:styleId="CommentTextChar" w:type="character">
+  <w:style w:type="character" w:customStyle="1" w:styleId="CommentTextChar">
     <w:name w:val="Comment Text Char"/>
     <w:basedOn w:val="DefaultParagraphFont"/>
     <w:link w:val="CommentText"/>
@@ -1312,7 +1312,7 @@
     <w:semiHidden/>
     <w:rsid w:val="00A4097A"/>
   </w:style>
-  <w:style w:styleId="CommentSubject" w:type="paragraph">
+  <w:style w:type="paragraph" w:styleId="CommentSubject">
     <w:name w:val="annotation subject"/>
     <w:basedOn w:val="CommentText"/>
     <w:next w:val="CommentText"/>
@@ -1328,7 +1328,7 @@
       <w:szCs w:val="20"/>
     </w:rPr>
   </w:style>
-  <w:style w:customStyle="1" w:styleId="CommentSubjectChar" w:type="character">
+  <w:style w:type="character" w:customStyle="1" w:styleId="CommentSubjectChar">
     <w:name w:val="Comment Subject Char"/>
     <w:basedOn w:val="CommentTextChar"/>
     <w:link w:val="CommentSubject"/>
@@ -1342,7 +1342,7 @@
       <w:szCs w:val="20"/>
     </w:rPr>
   </w:style>
-  <w:style w:styleId="BalloonText" w:type="paragraph">
+  <w:style w:type="paragraph" w:styleId="BalloonText">
     <w:name w:val="Balloon Text"/>
     <w:basedOn w:val="Normal"/>
     <w:link w:val="BalloonTextChar"/>
@@ -1356,7 +1356,7 @@
       <w:szCs w:val="18"/>
     </w:rPr>
   </w:style>
-  <w:style w:customStyle="1" w:styleId="BalloonTextChar" w:type="character">
+  <w:style w:type="character" w:customStyle="1" w:styleId="BalloonTextChar">
     <w:name w:val="Balloon Text Char"/>
     <w:basedOn w:val="DefaultParagraphFont"/>
     <w:link w:val="BalloonText"/>
@@ -1369,50 +1369,50 @@
       <w:szCs w:val="18"/>
     </w:rPr>
   </w:style>
-  <w:style w:customStyle="1" w:styleId="Heading2Char" w:type="character">
+  <w:style w:type="character" w:customStyle="1" w:styleId="Heading2Char">
     <w:name w:val="Heading 2 Char"/>
     <w:basedOn w:val="DefaultParagraphFont"/>
     <w:link w:val="Heading2"/>
     <w:uiPriority w:val="9"/>
     <w:rsid w:val="00F255AE"/>
     <w:rPr>
-      <w:rFonts w:asciiTheme="majorHAnsi" w:cstheme="majorBidi" w:eastAsiaTheme="majorEastAsia" w:hAnsiTheme="majorHAnsi"/>
+      <w:rFonts w:asciiTheme="majorHAnsi" w:eastAsiaTheme="majorEastAsia" w:hAnsiTheme="majorHAnsi" w:cstheme="majorBidi"/>
       <w:b/>
       <w:bCs/>
-      <w:color w:themeColor="accent1" w:val="4F81BD"/>
+      <w:color w:val="4F81BD" w:themeColor="accent1"/>
       <w:sz w:val="26"/>
       <w:szCs w:val="26"/>
     </w:rPr>
   </w:style>
-  <w:style w:customStyle="1" w:styleId="Heading3Char" w:type="character">
+  <w:style w:type="character" w:customStyle="1" w:styleId="Heading3Char">
     <w:name w:val="Heading 3 Char"/>
     <w:basedOn w:val="DefaultParagraphFont"/>
     <w:link w:val="Heading3"/>
     <w:uiPriority w:val="9"/>
     <w:rsid w:val="003A733F"/>
     <w:rPr>
-      <w:rFonts w:asciiTheme="majorHAnsi" w:cstheme="majorBidi" w:eastAsiaTheme="majorEastAsia" w:hAnsiTheme="majorHAnsi"/>
+      <w:rFonts w:asciiTheme="majorHAnsi" w:eastAsiaTheme="majorEastAsia" w:hAnsiTheme="majorHAnsi" w:cstheme="majorBidi"/>
       <w:b/>
       <w:bCs/>
-      <w:color w:themeColor="accent1" w:val="4F81BD"/>
-    </w:rPr>
-  </w:style>
-  <w:style w:customStyle="1" w:styleId="Heading4Char" w:type="character">
+      <w:color w:val="4F81BD" w:themeColor="accent1"/>
+    </w:rPr>
+  </w:style>
+  <w:style w:type="character" w:customStyle="1" w:styleId="Heading4Char">
     <w:name w:val="Heading 4 Char"/>
     <w:basedOn w:val="DefaultParagraphFont"/>
     <w:link w:val="Heading4"/>
     <w:uiPriority w:val="9"/>
     <w:rsid w:val="00037A74"/>
     <w:rPr>
-      <w:rFonts w:asciiTheme="majorHAnsi" w:cstheme="majorBidi" w:eastAsiaTheme="majorEastAsia" w:hAnsiTheme="majorHAnsi"/>
+      <w:rFonts w:asciiTheme="majorHAnsi" w:eastAsiaTheme="majorEastAsia" w:hAnsiTheme="majorHAnsi" w:cstheme="majorBidi"/>
       <w:b/>
       <w:bCs/>
       <w:i/>
       <w:iCs/>
-      <w:color w:themeColor="accent1" w:val="4F81BD"/>
-    </w:rPr>
-  </w:style>
-  <w:style w:styleId="ListParagraph" w:type="paragraph">
+      <w:color w:val="4F81BD" w:themeColor="accent1"/>
+    </w:rPr>
+  </w:style>
+  <w:style w:type="paragraph" w:styleId="ListParagraph">
     <w:name w:val="List Paragraph"/>
     <w:basedOn w:val="Normal"/>
     <w:uiPriority w:val="34"/>
@@ -1423,18 +1423,18 @@
       <w:contextualSpacing/>
     </w:pPr>
   </w:style>
-  <w:style w:styleId="Hyperlink" w:type="character">
+  <w:style w:type="character" w:styleId="Hyperlink">
     <w:name w:val="Hyperlink"/>
     <w:basedOn w:val="DefaultParagraphFont"/>
     <w:uiPriority w:val="99"/>
     <w:unhideWhenUsed/>
     <w:rsid w:val="00944E43"/>
     <w:rPr>
-      <w:color w:themeColor="hyperlink" w:val="0000FF"/>
+      <w:color w:val="0000FF" w:themeColor="hyperlink"/>
       <w:u w:val="single"/>
     </w:rPr>
   </w:style>
-  <w:style w:styleId="FollowedHyperlink" w:type="character">
+  <w:style w:type="character" w:styleId="FollowedHyperlink">
     <w:name w:val="FollowedHyperlink"/>
     <w:basedOn w:val="DefaultParagraphFont"/>
     <w:uiPriority w:val="99"/>
@@ -1442,42 +1442,42 @@
     <w:unhideWhenUsed/>
     <w:rsid w:val="00944E43"/>
     <w:rPr>
-      <w:color w:themeColor="followedHyperlink" w:val="800080"/>
+      <w:color w:val="800080" w:themeColor="followedHyperlink"/>
       <w:u w:val="single"/>
     </w:rPr>
   </w:style>
-  <w:style w:styleId="TableGrid" w:type="table">
+  <w:style w:type="table" w:styleId="TableGrid">
     <w:name w:val="Table Grid"/>
     <w:basedOn w:val="TableNormal"/>
     <w:uiPriority w:val="59"/>
     <w:rsid w:val="00F55EE2"/>
     <w:tblPr>
       <w:tblBorders>
-        <w:top w:color="auto" w:space="0" w:sz="4" w:val="single"/>
-        <w:left w:color="auto" w:space="0" w:sz="4" w:val="single"/>
-        <w:bottom w:color="auto" w:space="0" w:sz="4" w:val="single"/>
-        <w:right w:color="auto" w:space="0" w:sz="4" w:val="single"/>
-        <w:insideH w:color="auto" w:space="0" w:sz="4" w:val="single"/>
-        <w:insideV w:color="auto" w:space="0" w:sz="4" w:val="single"/>
+        <w:top w:val="single" w:sz="4" w:space="0" w:color="auto"/>
+        <w:left w:val="single" w:sz="4" w:space="0" w:color="auto"/>
+        <w:bottom w:val="single" w:sz="4" w:space="0" w:color="auto"/>
+        <w:right w:val="single" w:sz="4" w:space="0" w:color="auto"/>
+        <w:insideH w:val="single" w:sz="4" w:space="0" w:color="auto"/>
+        <w:insideV w:val="single" w:sz="4" w:space="0" w:color="auto"/>
       </w:tblBorders>
     </w:tblPr>
   </w:style>
-  <w:style w:customStyle="1" w:styleId="Heading1Char" w:type="character">
+  <w:style w:type="character" w:customStyle="1" w:styleId="Heading1Char">
     <w:name w:val="Heading 1 Char"/>
     <w:basedOn w:val="DefaultParagraphFont"/>
     <w:link w:val="Heading1"/>
     <w:uiPriority w:val="9"/>
     <w:rsid w:val="000A70D6"/>
     <w:rPr>
-      <w:rFonts w:asciiTheme="majorHAnsi" w:cstheme="majorBidi" w:eastAsiaTheme="majorEastAsia" w:hAnsiTheme="majorHAnsi"/>
+      <w:rFonts w:asciiTheme="majorHAnsi" w:eastAsiaTheme="majorEastAsia" w:hAnsiTheme="majorHAnsi" w:cstheme="majorBidi"/>
       <w:b/>
       <w:bCs/>
-      <w:color w:themeColor="accent1" w:themeShade="B5" w:val="345A8A"/>
+      <w:color w:val="345A8A" w:themeColor="accent1" w:themeShade="B5"/>
       <w:sz w:val="32"/>
       <w:szCs w:val="32"/>
     </w:rPr>
   </w:style>
-  <w:style w:styleId="DocumentMap" w:type="paragraph">
+  <w:style w:type="paragraph" w:styleId="DocumentMap">
     <w:name w:val="Document Map"/>
     <w:basedOn w:val="Normal"/>
     <w:link w:val="DocumentMapChar"/>
@@ -1486,10 +1486,10 @@
     <w:unhideWhenUsed/>
     <w:rsid w:val="00DF27B9"/>
     <w:rPr>
-      <w:rFonts w:ascii="Lucida Grande" w:cs="Lucida Grande" w:hAnsi="Lucida Grande"/>
-    </w:rPr>
-  </w:style>
-  <w:style w:customStyle="1" w:styleId="DocumentMapChar" w:type="character">
+      <w:rFonts w:ascii="Lucida Grande" w:hAnsi="Lucida Grande" w:cs="Lucida Grande"/>
+    </w:rPr>
+  </w:style>
+  <w:style w:type="character" w:customStyle="1" w:styleId="DocumentMapChar">
     <w:name w:val="Document Map Char"/>
     <w:basedOn w:val="DefaultParagraphFont"/>
     <w:link w:val="DocumentMap"/>
@@ -1497,7 +1497,7 @@
     <w:semiHidden/>
     <w:rsid w:val="00DF27B9"/>
     <w:rPr>
-      <w:rFonts w:ascii="Lucida Grande" w:cs="Lucida Grande" w:hAnsi="Lucida Grande"/>
+      <w:rFonts w:ascii="Lucida Grande" w:hAnsi="Lucida Grande" w:cs="Lucida Grande"/>
     </w:rPr>
   </w:style>
   <w:style w:type="paragraph" w:customStyle="1" w:styleId="SourceCode">

</xml_diff>